<commit_message>
completed MVP srs v1.1
</commit_message>
<xml_diff>
--- a/Documentation/Scottish Sounds - System Requirements Specification 1.1.docx
+++ b/Documentation/Scottish Sounds - System Requirements Specification 1.1.docx
@@ -3238,10 +3238,7 @@
           </w:tcPr>
           <w:p>
             <w:r>
-              <w:t>Allow the user to toggle between video and audio-only playback</w:t>
-            </w:r>
-            <w:r>
-              <w:t>.</w:t>
+              <w:t>Allow the user to toggle between video and audio-only playback.</w:t>
             </w:r>
           </w:p>
         </w:tc>
@@ -3266,10 +3263,7 @@
           </w:tcPr>
           <w:p>
             <w:r>
-              <w:t>Allow the user to play the exercise recording, as audio or video</w:t>
-            </w:r>
-            <w:r>
-              <w:t>.</w:t>
+              <w:t>Allow the user to play the exercise recording, as audio or video.</w:t>
             </w:r>
           </w:p>
         </w:tc>
@@ -3489,10 +3483,7 @@
               <w:ind w:left="0"/>
             </w:pPr>
             <w:r>
-              <w:t>FR-0</w:t>
-            </w:r>
-            <w:r>
-              <w:t>9</w:t>
+              <w:t>FR-09</w:t>
             </w:r>
           </w:p>
         </w:tc>
@@ -3517,10 +3508,7 @@
               <w:ind w:left="0"/>
             </w:pPr>
             <w:r>
-              <w:t>FR-</w:t>
-            </w:r>
-            <w:r>
-              <w:t>10</w:t>
+              <w:t>FR-10</w:t>
             </w:r>
           </w:p>
         </w:tc>
@@ -3545,10 +3533,7 @@
               <w:ind w:left="0"/>
             </w:pPr>
             <w:r>
-              <w:t>FR-</w:t>
-            </w:r>
-            <w:r>
-              <w:t>11</w:t>
+              <w:t>FR-11</w:t>
             </w:r>
           </w:p>
         </w:tc>
@@ -3574,10 +3559,7 @@
             </w:pPr>
             <w:r>
               <w:lastRenderedPageBreak/>
-              <w:t>FR-</w:t>
-            </w:r>
-            <w:r>
-              <w:t>12</w:t>
+              <w:t>FR-12</w:t>
             </w:r>
           </w:p>
         </w:tc>
@@ -3627,10 +3609,7 @@
               <w:ind w:left="0"/>
             </w:pPr>
             <w:r>
-              <w:t>FR-</w:t>
-            </w:r>
-            <w:r>
-              <w:t>13</w:t>
+              <w:t>FR-13</w:t>
             </w:r>
           </w:p>
         </w:tc>
@@ -3865,10 +3844,7 @@
               <w:ind w:left="0"/>
             </w:pPr>
             <w:r>
-              <w:t>NFR-0</w:t>
-            </w:r>
-            <w:r>
-              <w:t>3</w:t>
+              <w:t>NFR-03</w:t>
             </w:r>
           </w:p>
         </w:tc>
@@ -3881,7 +3857,23 @@
               <w:ind w:left="0"/>
             </w:pPr>
             <w:r>
-              <w:t>All communication between components shall use HTTPS. If accounts are implemented, passwords shall be stored hashed and users shall be authenticated before accessing personal data.</w:t>
+              <w:t xml:space="preserve">All communication between components shall </w:t>
+            </w:r>
+            <w:proofErr w:type="gramStart"/>
+            <w:r>
+              <w:t>use</w:t>
+            </w:r>
+            <w:proofErr w:type="gramEnd"/>
+            <w:r>
+              <w:t xml:space="preserve"> HTTPS. If accounts are implemented, passwords shall be </w:t>
+            </w:r>
+            <w:proofErr w:type="gramStart"/>
+            <w:r>
+              <w:t>stored</w:t>
+            </w:r>
+            <w:proofErr w:type="gramEnd"/>
+            <w:r>
+              <w:t xml:space="preserve"> hashed and users shall be authenticated before accessing personal data.</w:t>
             </w:r>
           </w:p>
         </w:tc>
@@ -3955,10 +3947,7 @@
               <w:ind w:left="0"/>
             </w:pPr>
             <w:r>
-              <w:t>NFR-0</w:t>
-            </w:r>
-            <w:r>
-              <w:t>4</w:t>
+              <w:t>NFR-04</w:t>
             </w:r>
           </w:p>
         </w:tc>
@@ -3971,7 +3960,15 @@
               <w:ind w:left="0"/>
             </w:pPr>
             <w:r>
-              <w:t>The platform shall be hosted online with at least 99% monthly uptime.</w:t>
+              <w:t xml:space="preserve">The platform </w:t>
+            </w:r>
+            <w:proofErr w:type="gramStart"/>
+            <w:r>
+              <w:t>shall</w:t>
+            </w:r>
+            <w:proofErr w:type="gramEnd"/>
+            <w:r>
+              <w:t xml:space="preserve"> be hosted online with at least 99% monthly uptime.</w:t>
             </w:r>
           </w:p>
         </w:tc>
@@ -4045,10 +4042,7 @@
               <w:ind w:left="0"/>
             </w:pPr>
             <w:r>
-              <w:t>NFR-0</w:t>
-            </w:r>
-            <w:r>
-              <w:t>5</w:t>
+              <w:t>NFR-05</w:t>
             </w:r>
           </w:p>
         </w:tc>
@@ -4061,10 +4055,7 @@
               <w:ind w:left="0"/>
             </w:pPr>
             <w:r>
-              <w:t xml:space="preserve">The platform shall </w:t>
-            </w:r>
-            <w:r>
-              <w:t>conform to WCAG 2.1</w:t>
+              <w:t>The platform shall conform to WCAG 2.1</w:t>
             </w:r>
           </w:p>
         </w:tc>
@@ -4138,10 +4129,7 @@
               <w:ind w:left="0"/>
             </w:pPr>
             <w:r>
-              <w:t>NFR-0</w:t>
-            </w:r>
-            <w:r>
-              <w:t>6</w:t>
+              <w:t>NFR-06</w:t>
             </w:r>
           </w:p>
         </w:tc>
@@ -4229,10 +4217,7 @@
               <w:ind w:left="0"/>
             </w:pPr>
             <w:r>
-              <w:t>NFR-0</w:t>
-            </w:r>
-            <w:r>
-              <w:t>7</w:t>
+              <w:t>NFR-07</w:t>
             </w:r>
           </w:p>
         </w:tc>
@@ -4264,7 +4249,26 @@
         <w:rPr>
           <w:color w:val="5A8080"/>
         </w:rPr>
-        <w:t>4.7 Other Quality Attributes</w:t>
+        <w:t>4</w:t>
+      </w:r>
+      <w:r>
+        <w:rPr>
+          <w:rStyle w:val="title2Char"/>
+        </w:rPr>
+        <w:t>.7 OTHER QUALITY</w:t>
+      </w:r>
+      <w:r>
+        <w:rPr>
+          <w:caps w:val="0"/>
+          <w:color w:val="5A8080"/>
+        </w:rPr>
+        <w:t xml:space="preserve"> </w:t>
+      </w:r>
+      <w:r>
+        <w:rPr>
+          <w:color w:val="5A8080"/>
+        </w:rPr>
+        <w:t>Attributes</w:t>
       </w:r>
       <w:bookmarkEnd w:id="42"/>
     </w:p>
@@ -4287,11 +4291,1155 @@
       </w:r>
       <w:bookmarkEnd w:id="43"/>
     </w:p>
+    <w:p>
+      <w:pPr>
+        <w:pStyle w:val="Heading2"/>
+        <w:rPr>
+          <w:color w:val="5A8080"/>
+        </w:rPr>
+      </w:pPr>
+      <w:r>
+        <w:rPr>
+          <w:color w:val="5A8080"/>
+        </w:rPr>
+        <w:t>5.1 User Interfaces</w:t>
+      </w:r>
+    </w:p>
+    <w:p>
+      <w:r>
+        <w:t xml:space="preserve">The MVP has a main exercise page </w:t>
+      </w:r>
+      <w:r>
+        <w:t>containing</w:t>
+      </w:r>
+      <w:r>
+        <w:t xml:space="preserve"> level picker (selection between available levels), video player, audio player, input box, IPA keyboard, answer feedback</w:t>
+      </w:r>
+      <w:r>
+        <w:t xml:space="preserve"> area, check input answer button, next exercise button.</w:t>
+      </w:r>
+    </w:p>
     <w:p/>
+    <w:p>
+      <w:pPr>
+        <w:pStyle w:val="title2"/>
+      </w:pPr>
+      <w:r>
+        <w:t>5.2 Hardware Interfaces</w:t>
+      </w:r>
+    </w:p>
+    <w:p>
+      <w:r>
+        <w:t xml:space="preserve">No specialized hardware is needed to </w:t>
+      </w:r>
+      <w:proofErr w:type="spellStart"/>
+      <w:r>
+        <w:t>utilise</w:t>
+      </w:r>
+      <w:proofErr w:type="spellEnd"/>
+      <w:r>
+        <w:t xml:space="preserve"> the platform, just a device with a screen, audio output and input either touch screen or mouse.</w:t>
+      </w:r>
+    </w:p>
     <w:p/>
+    <w:p>
+      <w:pPr>
+        <w:pStyle w:val="title2"/>
+      </w:pPr>
+      <w:r>
+        <w:t>5.3 Software interfaces</w:t>
+      </w:r>
+    </w:p>
+    <w:p>
+      <w:r>
+        <w:t xml:space="preserve">The </w:t>
+      </w:r>
+      <w:r>
+        <w:t>front end</w:t>
+      </w:r>
+      <w:r>
+        <w:t xml:space="preserve"> communicates with the </w:t>
+      </w:r>
+      <w:proofErr w:type="gramStart"/>
+      <w:r>
+        <w:t>API,</w:t>
+      </w:r>
+      <w:proofErr w:type="gramEnd"/>
+      <w:r>
+        <w:t xml:space="preserve"> the API communicates with the NoSQL database</w:t>
+      </w:r>
+      <w:r>
+        <w:t>. Media files are held in an object storage.</w:t>
+      </w:r>
+    </w:p>
+    <w:p/>
+    <w:p>
+      <w:pPr>
+        <w:pStyle w:val="title2"/>
+      </w:pPr>
+      <w:r>
+        <w:t>5.4 Communications Interfaces</w:t>
+      </w:r>
+    </w:p>
+    <w:p>
+      <w:r>
+        <w:t>All communication uses HTTPS as per NFR-03.</w:t>
+      </w:r>
+    </w:p>
+    <w:p/>
+    <w:p>
+      <w:pPr>
+        <w:pStyle w:val="Heading1"/>
+      </w:pPr>
+      <w:r>
+        <w:t>6. Other Requirements</w:t>
+      </w:r>
+    </w:p>
+    <w:p>
+      <w:pPr>
+        <w:pStyle w:val="title2"/>
+      </w:pPr>
+      <w:r>
+        <w:t>6.1 Legal or Regulatory Requirements</w:t>
+      </w:r>
+    </w:p>
+    <w:p>
+      <w:r>
+        <w:t xml:space="preserve">UK GDPR applies to the recordings of </w:t>
+      </w:r>
+      <w:r>
+        <w:t xml:space="preserve">identifiable </w:t>
+      </w:r>
+      <w:r>
+        <w:t>speakers, no user data is stored in the MVP build. Each recorded word will be contractually agreed and used withing speaker’s permission and with their right to withdraw their consent.</w:t>
+      </w:r>
+    </w:p>
+    <w:p/>
+    <w:p>
+      <w:pPr>
+        <w:pStyle w:val="title2"/>
+      </w:pPr>
+      <w:r>
+        <w:t>6.2 Packaging, Installation and Deployment</w:t>
+      </w:r>
+    </w:p>
+    <w:p>
+      <w:r>
+        <w:t>The platform will be available online as a hosted web application, no installation required. Each release should be deployable without downtime to the hosting services listed under section 2.4.</w:t>
+      </w:r>
+    </w:p>
+    <w:p/>
+    <w:p>
+      <w:pPr>
+        <w:pStyle w:val="title2"/>
+      </w:pPr>
+      <w:r>
+        <w:lastRenderedPageBreak/>
+        <w:t>6.</w:t>
+      </w:r>
+      <w:r>
+        <w:t>3</w:t>
+      </w:r>
+      <w:r>
+        <w:t xml:space="preserve"> Internationalisation and Localisation</w:t>
+      </w:r>
+    </w:p>
+    <w:p>
+      <w:r>
+        <w:t>The exercise content targets Scottish English speech sounds. The interface uses UK English. IPA symbols shall be encoded digitally using Unicode and display correctly in all browsers listed in NFR-07</w:t>
+      </w:r>
+      <w:r>
+        <w:t>. Diversifying Scottish accents is out of scope for the MVP.</w:t>
+      </w:r>
+    </w:p>
+    <w:p/>
+    <w:p>
+      <w:pPr>
+        <w:pStyle w:val="title2"/>
+      </w:pPr>
+      <w:r>
+        <w:t>6.4 Data Requirements</w:t>
+      </w:r>
+    </w:p>
+    <w:p>
+      <w:r>
+        <w:t>Exercise metadata is held in NoSQL database. Each exercise stored a difficulty level associated with it, solution, and reference to its recording.</w:t>
+      </w:r>
+    </w:p>
+    <w:p>
+      <w:r>
+        <w:t>Video and audio are stored in object storage.</w:t>
+      </w:r>
+    </w:p>
+    <w:p>
+      <w:r>
+        <w:t xml:space="preserve">The MVP prototype will contain 10 to 15 exercises, of which each has 5 seconds maximum recording, served at up to 1080p. No user data is stored for </w:t>
+      </w:r>
+      <w:proofErr w:type="gramStart"/>
+      <w:r>
+        <w:t>the MVP</w:t>
+      </w:r>
+      <w:proofErr w:type="gramEnd"/>
+      <w:r>
+        <w:t>. If speaker withdraws consent all recordings associated with them shall be removed.</w:t>
+      </w:r>
+    </w:p>
+    <w:p/>
+    <w:p>
+      <w:pPr>
+        <w:pStyle w:val="Heading1"/>
+      </w:pPr>
+      <w:r>
+        <w:t>7. Verification and Validation</w:t>
+      </w:r>
+    </w:p>
+    <w:p>
+      <w:pPr>
+        <w:pStyle w:val="title2"/>
+      </w:pPr>
+      <w:r>
+        <w:t>7.1 Requirements Verification Methods</w:t>
+      </w:r>
+    </w:p>
+    <w:p>
+      <w:r>
+        <w:t>Methodologies to verify requirement fulfilment are either through Testing (T), Demonstration (D</w:t>
+      </w:r>
+      <w:proofErr w:type="gramStart"/>
+      <w:r>
+        <w:t>),  Inspection</w:t>
+      </w:r>
+      <w:proofErr w:type="gramEnd"/>
+      <w:r>
+        <w:t xml:space="preserve"> (I) or Analysis (A).</w:t>
+      </w:r>
+    </w:p>
+    <w:p/>
+    <w:tbl>
+      <w:tblPr>
+        <w:tblStyle w:val="TableGrid"/>
+        <w:tblW w:w="0" w:type="auto"/>
+        <w:jc w:val="center"/>
+        <w:tblLook w:val="04A0" w:firstRow="1" w:lastRow="0" w:firstColumn="1" w:lastColumn="0" w:noHBand="0" w:noVBand="1"/>
+      </w:tblPr>
+      <w:tblGrid>
+        <w:gridCol w:w="1766"/>
+        <w:gridCol w:w="1134"/>
+        <w:gridCol w:w="6378"/>
+      </w:tblGrid>
+      <w:tr>
+        <w:trPr>
+          <w:jc w:val="center"/>
+        </w:trPr>
+        <w:tc>
+          <w:tcPr>
+            <w:tcW w:w="1766" w:type="dxa"/>
+            <w:shd w:val="clear" w:color="auto" w:fill="D4E1ED" w:themeFill="accent1" w:themeFillTint="66"/>
+          </w:tcPr>
+          <w:p>
+            <w:pPr>
+              <w:ind w:left="0"/>
+            </w:pPr>
+            <w:r>
+              <w:t>Requirement ID</w:t>
+            </w:r>
+          </w:p>
+        </w:tc>
+        <w:tc>
+          <w:tcPr>
+            <w:tcW w:w="1134" w:type="dxa"/>
+            <w:shd w:val="clear" w:color="auto" w:fill="D4E1ED" w:themeFill="accent1" w:themeFillTint="66"/>
+          </w:tcPr>
+          <w:p>
+            <w:pPr>
+              <w:ind w:left="0"/>
+            </w:pPr>
+            <w:r>
+              <w:t>Method</w:t>
+            </w:r>
+          </w:p>
+        </w:tc>
+        <w:tc>
+          <w:tcPr>
+            <w:tcW w:w="6378" w:type="dxa"/>
+            <w:shd w:val="clear" w:color="auto" w:fill="D4E1ED" w:themeFill="accent1" w:themeFillTint="66"/>
+          </w:tcPr>
+          <w:p>
+            <w:pPr>
+              <w:ind w:left="0"/>
+            </w:pPr>
+            <w:r>
+              <w:t>How it’s verified</w:t>
+            </w:r>
+          </w:p>
+        </w:tc>
+      </w:tr>
+      <w:tr>
+        <w:trPr>
+          <w:jc w:val="center"/>
+        </w:trPr>
+        <w:tc>
+          <w:tcPr>
+            <w:tcW w:w="1766" w:type="dxa"/>
+          </w:tcPr>
+          <w:p>
+            <w:pPr>
+              <w:ind w:left="0"/>
+              <w:jc w:val="center"/>
+            </w:pPr>
+            <w:r>
+              <w:t>FR-01</w:t>
+            </w:r>
+          </w:p>
+        </w:tc>
+        <w:tc>
+          <w:tcPr>
+            <w:tcW w:w="1134" w:type="dxa"/>
+          </w:tcPr>
+          <w:p>
+            <w:pPr>
+              <w:ind w:left="0"/>
+              <w:jc w:val="center"/>
+            </w:pPr>
+            <w:r>
+              <w:t>T</w:t>
+            </w:r>
+          </w:p>
+        </w:tc>
+        <w:tc>
+          <w:tcPr>
+            <w:tcW w:w="6378" w:type="dxa"/>
+          </w:tcPr>
+          <w:p>
+            <w:pPr>
+              <w:ind w:left="0"/>
+            </w:pPr>
+            <w:r>
+              <w:t>Select each level and confirm that exercise served belongs to that difficulty level</w:t>
+            </w:r>
+          </w:p>
+        </w:tc>
+      </w:tr>
+      <w:tr>
+        <w:trPr>
+          <w:jc w:val="center"/>
+        </w:trPr>
+        <w:tc>
+          <w:tcPr>
+            <w:tcW w:w="1766" w:type="dxa"/>
+          </w:tcPr>
+          <w:p>
+            <w:pPr>
+              <w:ind w:left="0"/>
+              <w:jc w:val="center"/>
+            </w:pPr>
+            <w:r>
+              <w:t>FR-02</w:t>
+            </w:r>
+          </w:p>
+        </w:tc>
+        <w:tc>
+          <w:tcPr>
+            <w:tcW w:w="1134" w:type="dxa"/>
+          </w:tcPr>
+          <w:p>
+            <w:pPr>
+              <w:ind w:left="0"/>
+              <w:jc w:val="center"/>
+            </w:pPr>
+            <w:r>
+              <w:t>T</w:t>
+            </w:r>
+          </w:p>
+        </w:tc>
+        <w:tc>
+          <w:tcPr>
+            <w:tcW w:w="6378" w:type="dxa"/>
+          </w:tcPr>
+          <w:p>
+            <w:pPr>
+              <w:ind w:left="0"/>
+            </w:pPr>
+            <w:r>
+              <w:t>Toggle audio only and video mode and check the playback modes change accordingly</w:t>
+            </w:r>
+          </w:p>
+        </w:tc>
+      </w:tr>
+      <w:tr>
+        <w:trPr>
+          <w:jc w:val="center"/>
+        </w:trPr>
+        <w:tc>
+          <w:tcPr>
+            <w:tcW w:w="1766" w:type="dxa"/>
+          </w:tcPr>
+          <w:p>
+            <w:pPr>
+              <w:ind w:left="0"/>
+              <w:jc w:val="center"/>
+            </w:pPr>
+            <w:r>
+              <w:t>FR-03</w:t>
+            </w:r>
+          </w:p>
+        </w:tc>
+        <w:tc>
+          <w:tcPr>
+            <w:tcW w:w="1134" w:type="dxa"/>
+          </w:tcPr>
+          <w:p>
+            <w:pPr>
+              <w:ind w:left="0"/>
+              <w:jc w:val="center"/>
+            </w:pPr>
+            <w:r>
+              <w:t>T</w:t>
+            </w:r>
+          </w:p>
+        </w:tc>
+        <w:tc>
+          <w:tcPr>
+            <w:tcW w:w="6378" w:type="dxa"/>
+          </w:tcPr>
+          <w:p>
+            <w:pPr>
+              <w:ind w:left="0"/>
+            </w:pPr>
+            <w:r>
+              <w:t>Play audio and video and test it works</w:t>
+            </w:r>
+          </w:p>
+        </w:tc>
+      </w:tr>
+      <w:tr>
+        <w:trPr>
+          <w:jc w:val="center"/>
+        </w:trPr>
+        <w:tc>
+          <w:tcPr>
+            <w:tcW w:w="1766" w:type="dxa"/>
+          </w:tcPr>
+          <w:p>
+            <w:pPr>
+              <w:ind w:left="0"/>
+              <w:jc w:val="center"/>
+            </w:pPr>
+            <w:r>
+              <w:t>FR-04</w:t>
+            </w:r>
+          </w:p>
+        </w:tc>
+        <w:tc>
+          <w:tcPr>
+            <w:tcW w:w="1134" w:type="dxa"/>
+          </w:tcPr>
+          <w:p>
+            <w:pPr>
+              <w:ind w:left="0"/>
+              <w:jc w:val="center"/>
+            </w:pPr>
+            <w:r>
+              <w:t>T</w:t>
+            </w:r>
+          </w:p>
+        </w:tc>
+        <w:tc>
+          <w:tcPr>
+            <w:tcW w:w="6378" w:type="dxa"/>
+          </w:tcPr>
+          <w:p>
+            <w:pPr>
+              <w:ind w:left="0"/>
+            </w:pPr>
+            <w:r>
+              <w:t>Click each IPA symbol in keyboard and confirm its respective character is displayed in input box</w:t>
+            </w:r>
+          </w:p>
+        </w:tc>
+      </w:tr>
+      <w:tr>
+        <w:trPr>
+          <w:jc w:val="center"/>
+        </w:trPr>
+        <w:tc>
+          <w:tcPr>
+            <w:tcW w:w="1766" w:type="dxa"/>
+          </w:tcPr>
+          <w:p>
+            <w:pPr>
+              <w:ind w:left="0"/>
+              <w:jc w:val="center"/>
+            </w:pPr>
+            <w:r>
+              <w:t>FR-05</w:t>
+            </w:r>
+          </w:p>
+        </w:tc>
+        <w:tc>
+          <w:tcPr>
+            <w:tcW w:w="1134" w:type="dxa"/>
+          </w:tcPr>
+          <w:p>
+            <w:pPr>
+              <w:ind w:left="0"/>
+              <w:jc w:val="center"/>
+            </w:pPr>
+            <w:r>
+              <w:t>T</w:t>
+            </w:r>
+          </w:p>
+        </w:tc>
+        <w:tc>
+          <w:tcPr>
+            <w:tcW w:w="6378" w:type="dxa"/>
+          </w:tcPr>
+          <w:p>
+            <w:pPr>
+              <w:ind w:left="0"/>
+            </w:pPr>
+            <w:r>
+              <w:t>Click check answer and confirm each is compared against the stored solution</w:t>
+            </w:r>
+          </w:p>
+        </w:tc>
+      </w:tr>
+      <w:tr>
+        <w:trPr>
+          <w:jc w:val="center"/>
+        </w:trPr>
+        <w:tc>
+          <w:tcPr>
+            <w:tcW w:w="1766" w:type="dxa"/>
+          </w:tcPr>
+          <w:p>
+            <w:pPr>
+              <w:ind w:left="0"/>
+              <w:jc w:val="center"/>
+            </w:pPr>
+            <w:r>
+              <w:t>FR-06</w:t>
+            </w:r>
+          </w:p>
+        </w:tc>
+        <w:tc>
+          <w:tcPr>
+            <w:tcW w:w="1134" w:type="dxa"/>
+          </w:tcPr>
+          <w:p>
+            <w:pPr>
+              <w:ind w:left="0"/>
+              <w:jc w:val="center"/>
+            </w:pPr>
+            <w:r>
+              <w:t>T</w:t>
+            </w:r>
+          </w:p>
+        </w:tc>
+        <w:tc>
+          <w:tcPr>
+            <w:tcW w:w="6378" w:type="dxa"/>
+          </w:tcPr>
+          <w:p>
+            <w:pPr>
+              <w:ind w:left="0"/>
+            </w:pPr>
+            <w:r>
+              <w:t xml:space="preserve">Submit fully correct, partly correct and incorrect answers and check the character counts and right or wrong marking </w:t>
+            </w:r>
+          </w:p>
+        </w:tc>
+      </w:tr>
+      <w:tr>
+        <w:trPr>
+          <w:jc w:val="center"/>
+        </w:trPr>
+        <w:tc>
+          <w:tcPr>
+            <w:tcW w:w="1766" w:type="dxa"/>
+          </w:tcPr>
+          <w:p>
+            <w:pPr>
+              <w:ind w:left="0"/>
+              <w:jc w:val="center"/>
+            </w:pPr>
+            <w:r>
+              <w:t>FR-07</w:t>
+            </w:r>
+          </w:p>
+        </w:tc>
+        <w:tc>
+          <w:tcPr>
+            <w:tcW w:w="1134" w:type="dxa"/>
+          </w:tcPr>
+          <w:p>
+            <w:pPr>
+              <w:ind w:left="0"/>
+              <w:jc w:val="center"/>
+            </w:pPr>
+            <w:r>
+              <w:t>T</w:t>
+            </w:r>
+          </w:p>
+        </w:tc>
+        <w:tc>
+          <w:tcPr>
+            <w:tcW w:w="6378" w:type="dxa"/>
+          </w:tcPr>
+          <w:p>
+            <w:pPr>
+              <w:ind w:left="0"/>
+            </w:pPr>
+            <w:r>
+              <w:t>Confirl reveal answer is available only after submitting a populated answer</w:t>
+            </w:r>
+          </w:p>
+        </w:tc>
+      </w:tr>
+      <w:tr>
+        <w:trPr>
+          <w:jc w:val="center"/>
+        </w:trPr>
+        <w:tc>
+          <w:tcPr>
+            <w:tcW w:w="1766" w:type="dxa"/>
+          </w:tcPr>
+          <w:p>
+            <w:pPr>
+              <w:ind w:left="0"/>
+              <w:jc w:val="center"/>
+            </w:pPr>
+            <w:r>
+              <w:t>FR-08</w:t>
+            </w:r>
+          </w:p>
+        </w:tc>
+        <w:tc>
+          <w:tcPr>
+            <w:tcW w:w="1134" w:type="dxa"/>
+          </w:tcPr>
+          <w:p>
+            <w:pPr>
+              <w:ind w:left="0"/>
+              <w:jc w:val="center"/>
+            </w:pPr>
+            <w:r>
+              <w:t>T</w:t>
+            </w:r>
+          </w:p>
+        </w:tc>
+        <w:tc>
+          <w:tcPr>
+            <w:tcW w:w="6378" w:type="dxa"/>
+          </w:tcPr>
+          <w:p>
+            <w:pPr>
+              <w:ind w:left="0"/>
+            </w:pPr>
+            <w:r>
+              <w:t>Confirm next exercise button loads new exercise</w:t>
+            </w:r>
+          </w:p>
+        </w:tc>
+      </w:tr>
+      <w:tr>
+        <w:trPr>
+          <w:jc w:val="center"/>
+        </w:trPr>
+        <w:tc>
+          <w:tcPr>
+            <w:tcW w:w="1766" w:type="dxa"/>
+          </w:tcPr>
+          <w:p>
+            <w:pPr>
+              <w:ind w:left="0"/>
+              <w:jc w:val="center"/>
+            </w:pPr>
+            <w:r>
+              <w:t>NFR-01</w:t>
+            </w:r>
+          </w:p>
+        </w:tc>
+        <w:tc>
+          <w:tcPr>
+            <w:tcW w:w="1134" w:type="dxa"/>
+          </w:tcPr>
+          <w:p>
+            <w:pPr>
+              <w:ind w:left="0"/>
+              <w:jc w:val="center"/>
+            </w:pPr>
+            <w:r>
+              <w:t>T</w:t>
+            </w:r>
+          </w:p>
+        </w:tc>
+        <w:tc>
+          <w:tcPr>
+            <w:tcW w:w="6378" w:type="dxa"/>
+          </w:tcPr>
+          <w:p>
+            <w:pPr>
+              <w:ind w:left="0"/>
+            </w:pPr>
+            <w:r>
+              <w:t>Payload test</w:t>
+            </w:r>
+          </w:p>
+        </w:tc>
+      </w:tr>
+      <w:tr>
+        <w:trPr>
+          <w:jc w:val="center"/>
+        </w:trPr>
+        <w:tc>
+          <w:tcPr>
+            <w:tcW w:w="1766" w:type="dxa"/>
+          </w:tcPr>
+          <w:p>
+            <w:pPr>
+              <w:ind w:left="0"/>
+              <w:jc w:val="center"/>
+            </w:pPr>
+            <w:r>
+              <w:t>NFR-02</w:t>
+            </w:r>
+          </w:p>
+        </w:tc>
+        <w:tc>
+          <w:tcPr>
+            <w:tcW w:w="1134" w:type="dxa"/>
+          </w:tcPr>
+          <w:p>
+            <w:pPr>
+              <w:ind w:left="0"/>
+              <w:jc w:val="center"/>
+            </w:pPr>
+            <w:r>
+              <w:t>A</w:t>
+            </w:r>
+          </w:p>
+        </w:tc>
+        <w:tc>
+          <w:tcPr>
+            <w:tcW w:w="6378" w:type="dxa"/>
+          </w:tcPr>
+          <w:p>
+            <w:pPr>
+              <w:ind w:left="0"/>
+            </w:pPr>
+            <w:r>
+              <w:t>Review hosting setup and code scalability, confirming capacity can be expanded within acceptable downtime</w:t>
+            </w:r>
+          </w:p>
+        </w:tc>
+      </w:tr>
+      <w:tr>
+        <w:trPr>
+          <w:jc w:val="center"/>
+        </w:trPr>
+        <w:tc>
+          <w:tcPr>
+            <w:tcW w:w="1766" w:type="dxa"/>
+          </w:tcPr>
+          <w:p>
+            <w:pPr>
+              <w:ind w:left="0"/>
+              <w:jc w:val="center"/>
+            </w:pPr>
+            <w:r>
+              <w:lastRenderedPageBreak/>
+              <w:t>NFR-03</w:t>
+            </w:r>
+          </w:p>
+        </w:tc>
+        <w:tc>
+          <w:tcPr>
+            <w:tcW w:w="1134" w:type="dxa"/>
+          </w:tcPr>
+          <w:p>
+            <w:pPr>
+              <w:ind w:left="0"/>
+              <w:jc w:val="center"/>
+            </w:pPr>
+            <w:r>
+              <w:t>I, T</w:t>
+            </w:r>
+          </w:p>
+        </w:tc>
+        <w:tc>
+          <w:tcPr>
+            <w:tcW w:w="6378" w:type="dxa"/>
+          </w:tcPr>
+          <w:p>
+            <w:pPr>
+              <w:ind w:left="0"/>
+            </w:pPr>
+            <w:r>
+              <w:t>Inspect components and confirm HTTP is refused or redirected, test HTTPS flows work as expected</w:t>
+            </w:r>
+          </w:p>
+        </w:tc>
+      </w:tr>
+      <w:tr>
+        <w:trPr>
+          <w:jc w:val="center"/>
+        </w:trPr>
+        <w:tc>
+          <w:tcPr>
+            <w:tcW w:w="1766" w:type="dxa"/>
+          </w:tcPr>
+          <w:p>
+            <w:pPr>
+              <w:ind w:left="0"/>
+              <w:jc w:val="center"/>
+            </w:pPr>
+            <w:r>
+              <w:t>NFR-04</w:t>
+            </w:r>
+          </w:p>
+        </w:tc>
+        <w:tc>
+          <w:tcPr>
+            <w:tcW w:w="1134" w:type="dxa"/>
+          </w:tcPr>
+          <w:p>
+            <w:pPr>
+              <w:ind w:left="0"/>
+              <w:jc w:val="center"/>
+            </w:pPr>
+            <w:r>
+              <w:t>A</w:t>
+            </w:r>
+          </w:p>
+        </w:tc>
+        <w:tc>
+          <w:tcPr>
+            <w:tcW w:w="6378" w:type="dxa"/>
+          </w:tcPr>
+          <w:p>
+            <w:pPr>
+              <w:ind w:left="0"/>
+            </w:pPr>
+            <w:r>
+              <w:t xml:space="preserve">Review monitoring data over a set time and confirm </w:t>
+            </w:r>
+            <w:proofErr w:type="gramStart"/>
+            <w:r>
+              <w:t>uptime</w:t>
+            </w:r>
+            <w:proofErr w:type="gramEnd"/>
+            <w:r>
+              <w:t xml:space="preserve"> against agreed target</w:t>
+            </w:r>
+          </w:p>
+        </w:tc>
+      </w:tr>
+      <w:tr>
+        <w:trPr>
+          <w:jc w:val="center"/>
+        </w:trPr>
+        <w:tc>
+          <w:tcPr>
+            <w:tcW w:w="1766" w:type="dxa"/>
+          </w:tcPr>
+          <w:p>
+            <w:pPr>
+              <w:ind w:left="0"/>
+              <w:jc w:val="center"/>
+            </w:pPr>
+            <w:r>
+              <w:t>NFR-05</w:t>
+            </w:r>
+          </w:p>
+        </w:tc>
+        <w:tc>
+          <w:tcPr>
+            <w:tcW w:w="1134" w:type="dxa"/>
+          </w:tcPr>
+          <w:p>
+            <w:pPr>
+              <w:ind w:left="0"/>
+              <w:jc w:val="center"/>
+            </w:pPr>
+            <w:r>
+              <w:t>I</w:t>
+            </w:r>
+          </w:p>
+        </w:tc>
+        <w:tc>
+          <w:tcPr>
+            <w:tcW w:w="6378" w:type="dxa"/>
+          </w:tcPr>
+          <w:p>
+            <w:pPr>
+              <w:ind w:left="0"/>
+            </w:pPr>
+            <w:r>
+              <w:t>Inspect UI to confirm it respects WCAG 2.1</w:t>
+            </w:r>
+          </w:p>
+        </w:tc>
+      </w:tr>
+      <w:tr>
+        <w:trPr>
+          <w:jc w:val="center"/>
+        </w:trPr>
+        <w:tc>
+          <w:tcPr>
+            <w:tcW w:w="1766" w:type="dxa"/>
+          </w:tcPr>
+          <w:p>
+            <w:pPr>
+              <w:ind w:left="0"/>
+              <w:jc w:val="center"/>
+            </w:pPr>
+            <w:r>
+              <w:t>NFR-06</w:t>
+            </w:r>
+          </w:p>
+        </w:tc>
+        <w:tc>
+          <w:tcPr>
+            <w:tcW w:w="1134" w:type="dxa"/>
+          </w:tcPr>
+          <w:p>
+            <w:pPr>
+              <w:ind w:left="0"/>
+              <w:jc w:val="center"/>
+            </w:pPr>
+            <w:r>
+              <w:t>D</w:t>
+            </w:r>
+          </w:p>
+        </w:tc>
+        <w:tc>
+          <w:tcPr>
+            <w:tcW w:w="6378" w:type="dxa"/>
+          </w:tcPr>
+          <w:p>
+            <w:pPr>
+              <w:ind w:left="0"/>
+            </w:pPr>
+            <w:r>
+              <w:t xml:space="preserve">Deploy system and demonstrate service stays available </w:t>
+            </w:r>
+          </w:p>
+        </w:tc>
+      </w:tr>
+      <w:tr>
+        <w:trPr>
+          <w:jc w:val="center"/>
+        </w:trPr>
+        <w:tc>
+          <w:tcPr>
+            <w:tcW w:w="1766" w:type="dxa"/>
+          </w:tcPr>
+          <w:p>
+            <w:pPr>
+              <w:ind w:left="0"/>
+              <w:jc w:val="center"/>
+            </w:pPr>
+            <w:r>
+              <w:t>NFR-07</w:t>
+            </w:r>
+          </w:p>
+        </w:tc>
+        <w:tc>
+          <w:tcPr>
+            <w:tcW w:w="1134" w:type="dxa"/>
+          </w:tcPr>
+          <w:p>
+            <w:pPr>
+              <w:ind w:left="0"/>
+              <w:jc w:val="center"/>
+            </w:pPr>
+            <w:r>
+              <w:t>T</w:t>
+            </w:r>
+          </w:p>
+        </w:tc>
+        <w:tc>
+          <w:tcPr>
+            <w:tcW w:w="6378" w:type="dxa"/>
+          </w:tcPr>
+          <w:p>
+            <w:pPr>
+              <w:ind w:left="0"/>
+            </w:pPr>
+            <w:r>
+              <w:t>Test exercise flow on listed browsers</w:t>
+            </w:r>
+          </w:p>
+        </w:tc>
+      </w:tr>
+    </w:tbl>
+    <w:p/>
+    <w:p>
+      <w:r>
+        <w:t xml:space="preserve">FR-09 to 13 </w:t>
+      </w:r>
+      <w:proofErr w:type="gramStart"/>
+      <w:r>
+        <w:t>are</w:t>
+      </w:r>
+      <w:proofErr w:type="gramEnd"/>
+      <w:r>
+        <w:t xml:space="preserve"> outside of MVP scope and won’t be verified at this stage.</w:t>
+      </w:r>
+    </w:p>
+    <w:p/>
+    <w:p>
+      <w:pPr>
+        <w:pStyle w:val="title2"/>
+      </w:pPr>
+      <w:r>
+        <w:t>7.2 Acceptance Criteria</w:t>
+      </w:r>
+    </w:p>
+    <w:p>
+      <w:r>
+        <w:t>The MVP is accepted when all functional and non-functional requirements are met and verified.</w:t>
+      </w:r>
+    </w:p>
+    <w:p/>
+    <w:p>
+      <w:pPr>
+        <w:pStyle w:val="Heading1"/>
+      </w:pPr>
+      <w:r>
+        <w:t>8. Appendices</w:t>
+      </w:r>
+    </w:p>
+    <w:p>
+      <w:pPr>
+        <w:pStyle w:val="title2"/>
+      </w:pPr>
+      <w:r>
+        <w:t>8.1 Appendix A: User and Task Analysis Document v1.0</w:t>
+      </w:r>
+    </w:p>
+    <w:p>
+      <w:pPr>
+        <w:rPr>
+          <w:lang w:val="en-GB"/>
+        </w:rPr>
+      </w:pPr>
+      <w:r>
+        <w:t xml:space="preserve">This document is available here: </w:t>
+      </w:r>
+      <w:hyperlink r:id="rId13" w:history="1">
+        <w:r>
+          <w:rPr>
+            <w:rStyle w:val="Hyperlink"/>
+            <w:lang w:val="en-GB"/>
+          </w:rPr>
+          <w:t>User and Task Analysis.docx</w:t>
+        </w:r>
+      </w:hyperlink>
+    </w:p>
+    <w:p>
+      <w:pPr>
+        <w:rPr>
+          <w:lang w:val="en-GB"/>
+        </w:rPr>
+      </w:pPr>
+    </w:p>
+    <w:p>
+      <w:pPr>
+        <w:pStyle w:val="title2"/>
+        <w:rPr>
+          <w:lang w:val="en-GB"/>
+        </w:rPr>
+      </w:pPr>
+      <w:r>
+        <w:rPr>
+          <w:lang w:val="en-GB"/>
+        </w:rPr>
+        <w:t xml:space="preserve">8.2 Appendix B: </w:t>
+      </w:r>
+      <w:r>
+        <w:rPr>
+          <w:lang w:val="en-GB"/>
+        </w:rPr>
+        <w:t>Software Architecture Report v1.1</w:t>
+      </w:r>
+    </w:p>
+    <w:p>
+      <w:pPr>
+        <w:rPr>
+          <w:lang w:val="en-GB"/>
+        </w:rPr>
+      </w:pPr>
+      <w:r>
+        <w:rPr>
+          <w:lang w:val="en-GB"/>
+        </w:rPr>
+        <w:t xml:space="preserve">This document is available here: </w:t>
+      </w:r>
+      <w:hyperlink r:id="rId14" w:history="1">
+        <w:r>
+          <w:rPr>
+            <w:rStyle w:val="Hyperlink"/>
+            <w:lang w:val="en-GB"/>
+          </w:rPr>
+          <w:t>Scottish Sounds Software Architecture Report 1.1.docx</w:t>
+        </w:r>
+      </w:hyperlink>
+    </w:p>
+    <w:p>
+      <w:pPr>
+        <w:rPr>
+          <w:lang w:val="en-GB"/>
+        </w:rPr>
+      </w:pPr>
+    </w:p>
+    <w:p>
+      <w:pPr>
+        <w:pStyle w:val="title2"/>
+        <w:rPr>
+          <w:lang w:val="en-GB"/>
+        </w:rPr>
+      </w:pPr>
+      <w:r>
+        <w:rPr>
+          <w:lang w:val="en-GB"/>
+        </w:rPr>
+        <w:t>8.3 Appendix c: Market research document</w:t>
+      </w:r>
+    </w:p>
+    <w:p>
+      <w:pPr>
+        <w:rPr>
+          <w:lang w:val="en-GB"/>
+        </w:rPr>
+      </w:pPr>
+      <w:r>
+        <w:rPr>
+          <w:lang w:val="en-GB"/>
+        </w:rPr>
+        <w:t xml:space="preserve">This document is available here: </w:t>
+      </w:r>
+      <w:hyperlink r:id="rId15" w:history="1">
+        <w:r>
+          <w:rPr>
+            <w:rStyle w:val="Hyperlink"/>
+            <w:lang w:val="en-GB"/>
+          </w:rPr>
+          <w:t>Marketresearch.md</w:t>
+        </w:r>
+      </w:hyperlink>
+    </w:p>
+    <w:p>
+      <w:pPr>
+        <w:rPr>
+          <w:lang w:val="en-GB"/>
+        </w:rPr>
+      </w:pPr>
+    </w:p>
     <w:sectPr>
-      <w:footerReference w:type="default" r:id="rId13"/>
-      <w:headerReference w:type="first" r:id="rId14"/>
+      <w:footerReference w:type="default" r:id="rId16"/>
+      <w:headerReference w:type="first" r:id="rId17"/>
       <w:pgSz w:w="12240" w:h="15840"/>
       <w:pgMar w:top="1440" w:right="1440" w:bottom="1440" w:left="1440" w:header="720" w:footer="720" w:gutter="0"/>
       <w:pgNumType w:start="0"/>
@@ -8772,6 +9920,41 @@
       <w:ind w:left="220"/>
     </w:pPr>
   </w:style>
+  <w:style w:type="paragraph" w:customStyle="1" w:styleId="title2">
+    <w:name w:val="title2"/>
+    <w:basedOn w:val="Heading2"/>
+    <w:link w:val="title2Char"/>
+    <w:qFormat/>
+    <w:rsid w:val="006C1CEB"/>
+    <w:rPr>
+      <w:color w:val="5A8080"/>
+    </w:rPr>
+  </w:style>
+  <w:style w:type="character" w:customStyle="1" w:styleId="title2Char">
+    <w:name w:val="title2 Char"/>
+    <w:basedOn w:val="Heading2Char"/>
+    <w:link w:val="title2"/>
+    <w:rsid w:val="006C1CEB"/>
+    <w:rPr>
+      <w:rFonts w:asciiTheme="majorHAnsi" w:eastAsiaTheme="majorEastAsia" w:hAnsiTheme="majorHAnsi" w:cstheme="majorBidi"/>
+      <w:caps/>
+      <w:color w:val="5A8080"/>
+      <w:sz w:val="24"/>
+      <w:szCs w:val="24"/>
+    </w:rPr>
+  </w:style>
+  <w:style w:type="character" w:styleId="UnresolvedMention">
+    <w:name w:val="Unresolved Mention"/>
+    <w:basedOn w:val="DefaultParagraphFont"/>
+    <w:uiPriority w:val="99"/>
+    <w:semiHidden/>
+    <w:unhideWhenUsed/>
+    <w:rsid w:val="00825A68"/>
+    <w:rPr>
+      <w:color w:val="605E5C"/>
+      <w:shd w:val="clear" w:color="auto" w:fill="E1DFDD"/>
+    </w:rPr>
+  </w:style>
 </w:styles>
 </file>
 
@@ -8886,8 +10069,12 @@
     <w:rsid w:val="000C6806"/>
     <w:rsid w:val="000F4DF1"/>
     <w:rsid w:val="001665A2"/>
+    <w:rsid w:val="001A0657"/>
+    <w:rsid w:val="00573CEF"/>
     <w:rsid w:val="00692B7E"/>
+    <w:rsid w:val="006A7EBB"/>
     <w:rsid w:val="007C7404"/>
+    <w:rsid w:val="00806A2E"/>
     <w:rsid w:val="008174DA"/>
     <w:rsid w:val="008A6415"/>
     <w:rsid w:val="00B5254E"/>

</xml_diff>

<commit_message>
correcter typos, added explaination of moscow, fr and nfr
</commit_message>
<xml_diff>
--- a/Documentation/Scottish Sounds - System Requirements Specification 1.1.docx
+++ b/Documentation/Scottish Sounds - System Requirements Specification 1.1.docx
@@ -3664,7 +3664,7 @@
         <w:pStyle w:val="ScotS-Title"/>
       </w:pPr>
       <w:r>
-        <w:t>The MVP consists of an exercise page and the architecture needed behind it, from the data layer to the API one. In scope withing the first MVP:</w:t>
+        <w:t>The MVP consists of an exercise page and the architecture needed behind it, from the data layer to the API one. In scope within the first MVP:</w:t>
       </w:r>
     </w:p>
     <w:p>
@@ -4214,7 +4214,24 @@
         <w:t xml:space="preserve"> </w:t>
       </w:r>
       <w:r>
-        <w:t>Priorities follow MoSCoW</w:t>
+        <w:t xml:space="preserve">Priorities follow </w:t>
+      </w:r>
+      <w:proofErr w:type="spellStart"/>
+      <w:r>
+        <w:t>MoSCoW</w:t>
+      </w:r>
+      <w:proofErr w:type="spellEnd"/>
+      <w:r>
+        <w:t xml:space="preserve"> </w:t>
+      </w:r>
+      <w:r>
+        <w:t>(</w:t>
+      </w:r>
+      <w:r>
+        <w:t>Must have</w:t>
+      </w:r>
+      <w:r>
+        <w:t>, Should have, Could have, Won’t have)</w:t>
       </w:r>
       <w:r>
         <w:t>.</w:t>
@@ -4311,6 +4328,11 @@
       </w:pPr>
       <w:r>
         <w:t>Priority: must.</w:t>
+      </w:r>
+    </w:p>
+    <w:p>
+      <w:r>
+        <w:t>Functional requirements are identified with the code FR (Functional Requirement) and a number.</w:t>
       </w:r>
     </w:p>
     <w:p/>
@@ -4673,6 +4695,7 @@
               <w:ind w:left="0"/>
             </w:pPr>
             <w:r>
+              <w:lastRenderedPageBreak/>
               <w:t>FR-10</w:t>
             </w:r>
           </w:p>
@@ -4723,7 +4746,6 @@
               <w:ind w:left="0"/>
             </w:pPr>
             <w:r>
-              <w:lastRenderedPageBreak/>
               <w:t>FR-12</w:t>
             </w:r>
           </w:p>
@@ -4792,19 +4814,17 @@
     </w:tbl>
     <w:p>
       <w:pPr>
-        <w:pStyle w:val="TOC3"/>
-        <w:tabs>
-          <w:tab w:val="right" w:leader="dot" w:pos="9350"/>
-        </w:tabs>
-      </w:pPr>
-    </w:p>
-    <w:p>
-      <w:pPr>
         <w:pStyle w:val="Heading1"/>
       </w:pPr>
       <w:bookmarkStart w:id="33" w:name="_Toc242340725"/>
       <w:bookmarkStart w:id="34" w:name="_Toc242340850"/>
       <w:bookmarkStart w:id="35" w:name="_Toc243654227"/>
+    </w:p>
+    <w:p/>
+    <w:p>
+      <w:pPr>
+        <w:pStyle w:val="Heading1"/>
+      </w:pPr>
       <w:r>
         <w:t xml:space="preserve">4. </w:t>
       </w:r>
@@ -4824,6 +4844,12 @@
       </w:r>
       <w:r>
         <w:t>.</w:t>
+      </w:r>
+      <w:r>
+        <w:t xml:space="preserve"> </w:t>
+      </w:r>
+      <w:r>
+        <w:t>Non-functional requirements are identified with the code NFR (Non-Functional Requirement) and a number.</w:t>
       </w:r>
     </w:p>
     <w:p/>
@@ -5302,7 +5328,6 @@
         <w:rPr>
           <w:color w:val="5A8080"/>
         </w:rPr>
-        <w:lastRenderedPageBreak/>
         <w:t>4.6 Portability and Compatibility</w:t>
       </w:r>
       <w:bookmarkEnd w:id="41"/>
@@ -5475,7 +5500,15 @@
     </w:p>
     <w:p>
       <w:r>
-        <w:t>No specialized hardware is needed to utilise the platform, just a device with a screen, audio output and input either touch screen or mouse.</w:t>
+        <w:t xml:space="preserve">No specialized hardware is needed to </w:t>
+      </w:r>
+      <w:proofErr w:type="spellStart"/>
+      <w:r>
+        <w:t>utilise</w:t>
+      </w:r>
+      <w:proofErr w:type="spellEnd"/>
+      <w:r>
+        <w:t xml:space="preserve"> the platform, just a device with a screen, audio output and input either touch screen or mouse.</w:t>
       </w:r>
     </w:p>
     <w:p/>
@@ -5548,7 +5581,7 @@
         <w:t xml:space="preserve">identifiable </w:t>
       </w:r>
       <w:r>
-        <w:t>speakers, no user data is stored in the MVP build. Each recorded word will be contractually agreed and used withing speaker’s permission and with their right to withdraw their consent.</w:t>
+        <w:t>speakers, no user data is stored in the MVP build. Each recorded word will be contractually agreed and used within speaker’s permission and with their right to withdraw their consent.</w:t>
       </w:r>
     </w:p>
     <w:p/>
@@ -5574,7 +5607,6 @@
       </w:pPr>
       <w:bookmarkStart w:id="51" w:name="_Toc243654243"/>
       <w:r>
-        <w:lastRenderedPageBreak/>
         <w:t>6.</w:t>
       </w:r>
       <w:r>
@@ -6022,7 +6054,13 @@
               <w:ind w:left="0"/>
             </w:pPr>
             <w:r>
-              <w:t>Confirl reveal answer is available only after submitting a populated answer</w:t>
+              <w:t>Confir</w:t>
+            </w:r>
+            <w:r>
+              <w:t>m</w:t>
+            </w:r>
+            <w:r>
+              <w:t xml:space="preserve"> reveal answer is available only after submitting a populated answer</w:t>
             </w:r>
           </w:p>
         </w:tc>
@@ -6133,6 +6171,7 @@
               <w:jc w:val="center"/>
             </w:pPr>
             <w:r>
+              <w:lastRenderedPageBreak/>
               <w:t>NFR-02</w:t>
             </w:r>
           </w:p>
@@ -6179,7 +6218,6 @@
               <w:jc w:val="center"/>
             </w:pPr>
             <w:r>
-              <w:lastRenderedPageBreak/>
               <w:t>NFR-03</w:t>
             </w:r>
           </w:p>
@@ -11200,11 +11238,13 @@
     <w:rsid w:val="00692B7E"/>
     <w:rsid w:val="006A7EBB"/>
     <w:rsid w:val="007C7404"/>
+    <w:rsid w:val="008064C2"/>
     <w:rsid w:val="00806A2E"/>
     <w:rsid w:val="008174DA"/>
     <w:rsid w:val="008A6415"/>
     <w:rsid w:val="008D1569"/>
     <w:rsid w:val="00B5254E"/>
+    <w:rsid w:val="00B60880"/>
     <w:rsid w:val="00BB53A2"/>
     <w:rsid w:val="00CE6014"/>
     <w:rsid w:val="00D76DF2"/>
@@ -11940,6 +11980,39 @@
 </file>
 
 <file path=customXml/item2.xml><?xml version="1.0" encoding="utf-8"?>
+<?mso-contentType ?>
+<FormTemplates xmlns="http://schemas.microsoft.com/sharepoint/v3/contenttype/forms">
+  <Display>DocumentLibraryForm</Display>
+  <Edit>DocumentLibraryForm</Edit>
+  <New>DocumentLibraryForm</New>
+</FormTemplates>
+</file>
+
+<file path=customXml/item3.xml><?xml version="1.0" encoding="utf-8"?>
+<p:properties xmlns:p="http://schemas.microsoft.com/office/2006/metadata/properties" xmlns:xsi="http://www.w3.org/2001/XMLSchema-instance" xmlns:pc="http://schemas.microsoft.com/office/infopath/2007/PartnerControls">
+  <documentManagement>
+    <_ip_UnifiedCompliancePolicyUIAction xmlns="http://schemas.microsoft.com/sharepoint/v3" xsi:nil="true"/>
+    <Image xmlns="71af3243-3dd4-4a8d-8c0d-dd76da1f02a5">
+      <Url xsi:nil="true"/>
+      <Description xsi:nil="true"/>
+    </Image>
+    <Status xmlns="71af3243-3dd4-4a8d-8c0d-dd76da1f02a5">Not started</Status>
+    <Background xmlns="71af3243-3dd4-4a8d-8c0d-dd76da1f02a5">false</Background>
+    <_ip_UnifiedCompliancePolicyProperties xmlns="http://schemas.microsoft.com/sharepoint/v3" xsi:nil="true"/>
+    <ImageTagsTaxHTField xmlns="71af3243-3dd4-4a8d-8c0d-dd76da1f02a5">
+      <Terms xmlns="http://schemas.microsoft.com/office/infopath/2007/PartnerControls"/>
+    </ImageTagsTaxHTField>
+    <TaxCatchAll xmlns="230e9df3-be65-4c73-a93b-d1236ebd677e" xsi:nil="true"/>
+    <MediaServiceKeyPoints xmlns="71af3243-3dd4-4a8d-8c0d-dd76da1f02a5" xsi:nil="true"/>
+  </documentManagement>
+</p:properties>
+</file>
+
+<file path=customXml/item4.xml><?xml version="1.0" encoding="utf-8"?>
+<b:Sources xmlns:b="http://schemas.openxmlformats.org/officeDocument/2006/bibliography" xmlns="http://schemas.openxmlformats.org/officeDocument/2006/bibliography" SelectedStyle="\CTRHarvard_.xsl" StyleName="Harvard - UHI CTR" Version="1"/>
+</file>
+
+<file path=customXml/item5.xml><?xml version="1.0" encoding="utf-8"?>
 <ct:contentTypeSchema xmlns:ct="http://schemas.microsoft.com/office/2006/metadata/contentType" xmlns:ma="http://schemas.microsoft.com/office/2006/metadata/properties/metaAttributes" ct:_="" ma:_="" ma:contentTypeName="Document" ma:contentTypeID="0x01010079F111ED35F8CC479449609E8A0923A6" ma:contentTypeVersion="26" ma:contentTypeDescription="Create a new document." ma:contentTypeScope="" ma:versionID="ac37c1753acd5e330d2062ccec26ea66">
   <xsd:schema xmlns:xsd="http://www.w3.org/2001/XMLSchema" xmlns:xs="http://www.w3.org/2001/XMLSchema" xmlns:p="http://schemas.microsoft.com/office/2006/metadata/properties" xmlns:ns1="http://schemas.microsoft.com/sharepoint/v3" xmlns:ns2="71af3243-3dd4-4a8d-8c0d-dd76da1f02a5" xmlns:ns3="16c05727-aa75-4e4a-9b5f-8a80a1165891" xmlns:ns4="230e9df3-be65-4c73-a93b-d1236ebd677e" targetNamespace="http://schemas.microsoft.com/office/2006/metadata/properties" ma:root="true" ma:fieldsID="3b340c7101c92c5120abd06486f94548" ns1:_="" ns2:_="" ns3:_="" ns4:_="">
     <xsd:import namespace="http://schemas.microsoft.com/sharepoint/v3"/>
@@ -12239,39 +12312,6 @@
 </ct:contentTypeSchema>
 </file>
 
-<file path=customXml/item3.xml><?xml version="1.0" encoding="utf-8"?>
-<b:Sources xmlns:b="http://schemas.openxmlformats.org/officeDocument/2006/bibliography" xmlns="http://schemas.openxmlformats.org/officeDocument/2006/bibliography" SelectedStyle="\CTRHarvard_.xsl" StyleName="Harvard - UHI CTR" Version="1"/>
-</file>
-
-<file path=customXml/item4.xml><?xml version="1.0" encoding="utf-8"?>
-<p:properties xmlns:p="http://schemas.microsoft.com/office/2006/metadata/properties" xmlns:xsi="http://www.w3.org/2001/XMLSchema-instance" xmlns:pc="http://schemas.microsoft.com/office/infopath/2007/PartnerControls">
-  <documentManagement>
-    <_ip_UnifiedCompliancePolicyUIAction xmlns="http://schemas.microsoft.com/sharepoint/v3" xsi:nil="true"/>
-    <Image xmlns="71af3243-3dd4-4a8d-8c0d-dd76da1f02a5">
-      <Url xsi:nil="true"/>
-      <Description xsi:nil="true"/>
-    </Image>
-    <Status xmlns="71af3243-3dd4-4a8d-8c0d-dd76da1f02a5">Not started</Status>
-    <Background xmlns="71af3243-3dd4-4a8d-8c0d-dd76da1f02a5">false</Background>
-    <_ip_UnifiedCompliancePolicyProperties xmlns="http://schemas.microsoft.com/sharepoint/v3" xsi:nil="true"/>
-    <ImageTagsTaxHTField xmlns="71af3243-3dd4-4a8d-8c0d-dd76da1f02a5">
-      <Terms xmlns="http://schemas.microsoft.com/office/infopath/2007/PartnerControls"/>
-    </ImageTagsTaxHTField>
-    <TaxCatchAll xmlns="230e9df3-be65-4c73-a93b-d1236ebd677e" xsi:nil="true"/>
-    <MediaServiceKeyPoints xmlns="71af3243-3dd4-4a8d-8c0d-dd76da1f02a5" xsi:nil="true"/>
-  </documentManagement>
-</p:properties>
-</file>
-
-<file path=customXml/item5.xml><?xml version="1.0" encoding="utf-8"?>
-<?mso-contentType ?>
-<FormTemplates xmlns="http://schemas.microsoft.com/sharepoint/v3/contenttype/forms">
-  <Display>DocumentLibraryForm</Display>
-  <Edit>DocumentLibraryForm</Edit>
-  <New>DocumentLibraryForm</New>
-</FormTemplates>
-</file>
-
 <file path=customXml/itemProps1.xml><?xml version="1.0" encoding="utf-8"?>
 <ds:datastoreItem xmlns:ds="http://schemas.openxmlformats.org/officeDocument/2006/customXml" ds:itemID="{55AF091B-3C7A-41E3-B477-F2FDAA23CFDA}">
   <ds:schemaRefs>
@@ -12281,6 +12321,34 @@
 </file>
 
 <file path=customXml/itemProps2.xml><?xml version="1.0" encoding="utf-8"?>
+<ds:datastoreItem xmlns:ds="http://schemas.openxmlformats.org/officeDocument/2006/customXml" ds:itemID="{62D6560C-08F9-4F24-927E-D03DD3B4B4B1}">
+  <ds:schemaRefs>
+    <ds:schemaRef ds:uri="http://schemas.microsoft.com/sharepoint/v3/contenttype/forms"/>
+  </ds:schemaRefs>
+</ds:datastoreItem>
+</file>
+
+<file path=customXml/itemProps3.xml><?xml version="1.0" encoding="utf-8"?>
+<ds:datastoreItem xmlns:ds="http://schemas.openxmlformats.org/officeDocument/2006/customXml" ds:itemID="{1D2C2DCB-3412-42A2-A1FB-FD9939307C86}">
+  <ds:schemaRefs>
+    <ds:schemaRef ds:uri="http://schemas.microsoft.com/office/2006/metadata/properties"/>
+    <ds:schemaRef ds:uri="http://schemas.microsoft.com/office/infopath/2007/PartnerControls"/>
+    <ds:schemaRef ds:uri="http://schemas.microsoft.com/sharepoint/v3"/>
+    <ds:schemaRef ds:uri="71af3243-3dd4-4a8d-8c0d-dd76da1f02a5"/>
+    <ds:schemaRef ds:uri="230e9df3-be65-4c73-a93b-d1236ebd677e"/>
+  </ds:schemaRefs>
+</ds:datastoreItem>
+</file>
+
+<file path=customXml/itemProps4.xml><?xml version="1.0" encoding="utf-8"?>
+<ds:datastoreItem xmlns:ds="http://schemas.openxmlformats.org/officeDocument/2006/customXml" ds:itemID="{814EA4A6-5D88-4AAC-9E72-FE014129C5D0}">
+  <ds:schemaRefs>
+    <ds:schemaRef ds:uri="http://schemas.openxmlformats.org/officeDocument/2006/bibliography"/>
+  </ds:schemaRefs>
+</ds:datastoreItem>
+</file>
+
+<file path=customXml/itemProps5.xml><?xml version="1.0" encoding="utf-8"?>
 <ds:datastoreItem xmlns:ds="http://schemas.openxmlformats.org/officeDocument/2006/customXml" ds:itemID="{953640D3-68B6-4040-A529-D1E85A0123EC}">
   <ds:schemaRefs>
     <ds:schemaRef ds:uri="http://schemas.microsoft.com/office/2006/metadata/contentType"/>
@@ -12301,34 +12369,6 @@
 </ds:datastoreItem>
 </file>
 
-<file path=customXml/itemProps3.xml><?xml version="1.0" encoding="utf-8"?>
-<ds:datastoreItem xmlns:ds="http://schemas.openxmlformats.org/officeDocument/2006/customXml" ds:itemID="{814EA4A6-5D88-4AAC-9E72-FE014129C5D0}">
-  <ds:schemaRefs>
-    <ds:schemaRef ds:uri="http://schemas.openxmlformats.org/officeDocument/2006/bibliography"/>
-  </ds:schemaRefs>
-</ds:datastoreItem>
-</file>
-
-<file path=customXml/itemProps4.xml><?xml version="1.0" encoding="utf-8"?>
-<ds:datastoreItem xmlns:ds="http://schemas.openxmlformats.org/officeDocument/2006/customXml" ds:itemID="{1D2C2DCB-3412-42A2-A1FB-FD9939307C86}">
-  <ds:schemaRefs>
-    <ds:schemaRef ds:uri="http://schemas.microsoft.com/office/2006/metadata/properties"/>
-    <ds:schemaRef ds:uri="http://schemas.microsoft.com/office/infopath/2007/PartnerControls"/>
-    <ds:schemaRef ds:uri="http://schemas.microsoft.com/sharepoint/v3"/>
-    <ds:schemaRef ds:uri="71af3243-3dd4-4a8d-8c0d-dd76da1f02a5"/>
-    <ds:schemaRef ds:uri="230e9df3-be65-4c73-a93b-d1236ebd677e"/>
-  </ds:schemaRefs>
-</ds:datastoreItem>
-</file>
-
-<file path=customXml/itemProps5.xml><?xml version="1.0" encoding="utf-8"?>
-<ds:datastoreItem xmlns:ds="http://schemas.openxmlformats.org/officeDocument/2006/customXml" ds:itemID="{62D6560C-08F9-4F24-927E-D03DD3B4B4B1}">
-  <ds:schemaRefs>
-    <ds:schemaRef ds:uri="http://schemas.microsoft.com/sharepoint/v3/contenttype/forms"/>
-  </ds:schemaRefs>
-</ds:datastoreItem>
-</file>
-
 <file path=docMetadata/LabelInfo.xml><?xml version="1.0" encoding="utf-8"?>
 <clbl:labelList xmlns:clbl="http://schemas.microsoft.com/office/2020/mipLabelMetadata"/>
 </file>
</xml_diff>